<commit_message>
docs(rendusrncp): add fiche 9, sync bloc 2/4 dossiers with recettes_book  and incidents count
</commit_message>
<xml_diff>
--- a/rendusrncp/BLOC2_DOSSIER.docx
+++ b/rendusrncp/BLOC2_DOSSIER.docx
@@ -42,12 +42,8 @@
       <w:r>
         <w:t>Certification RNCP 39583 — Expert en Développement Logiciel</w:t>
         <w:br/>
-      </w:r>
-      <w:r>
         <w:t>Candidat : Charles Gauthier</w:t>
         <w:br/>
-      </w:r>
-      <w:r>
         <w:t>Version finale — Juillet 2026</w:t>
       </w:r>
     </w:p>
@@ -2320,7 +2316,7 @@
           <w:b w:val="0"/>
           <w:i w:val="0"/>
         </w:rPr>
-        <w:t>Le cahier de recettes (rendusrncp/CAHIER_RECETTES_BLOC2.xlsx, feuille « Cahier de recettes ») est structuré en colonnes : ID, Domaine, Type (fonctionnel / sécurité / structurel / accessibilité), Priorité, Scénario, Préconditions, Actions, Résultat attendu, Statut (À jouer / Passé / Échec), Test auto / Source, et Commentaire. Chaque scénario référence, quand il existe, le test automatisé qui le couvre (PHPUnit, Jest ou Cypress), sinon la procédure manuelle correspondante.</w:t>
+        <w:t>Le cahier de recettes (rendusrncp/cahier_recettes.xlsx, feuille « Cahier de recettes ») est structuré en colonnes : ID, Domaine, Type (fonctionnel / sécurité / structurel / accessibilité), Priorité, Scénario, Préconditions, Actions, Résultat attendu, Statut (À jouer / Passé / Échec), Test auto / Source, et Commentaire. Chaque scénario référence, quand il existe, le test automatisé qui le couvre (PHPUnit, Jest ou Cypress), sinon la procédure manuelle correspondante.</w:t>
       </w:r>
     </w:p>
     <w:p>
@@ -2328,7 +2324,7 @@
         <w:pStyle w:val="Heading2"/>
       </w:pPr>
       <w:r>
-        <w:t>Couverture — 94 scénarios</w:t>
+        <w:t>Couverture — 95 scénarios</w:t>
       </w:r>
     </w:p>
     <w:tbl>
@@ -2585,7 +2581,7 @@
           </w:tcPr>
           <w:p>
             <w:r>
-              <w:t>4</w:t>
+              <w:t>5</w:t>
             </w:r>
           </w:p>
         </w:tc>
@@ -2664,7 +2660,7 @@
           <w:b w:val="0"/>
           <w:i w:val="0"/>
         </w:rPr>
-        <w:t>Répartis par type : 46 fonctionnels, 38 sécurité, 7 structurels, 3 accessibilité. Répartis par priorité : 58 haute, 32 moyenne, 4 basse. Le domaine Paiement inclut notamment le scénario du challenge 3D Secure (carte de test Stripe), rejoué manuellement en staging.</w:t>
+        <w:t>Répartis par type : 46 fonctionnels, 38 sécurité, 8 structurels, 3 accessibilité. Répartis par priorité : 59 haute, 32 moyenne, 4 basse. Le domaine Paiement inclut notamment le scénario du challenge 3D Secure (carte de test Stripe), rejoué manuellement en staging.</w:t>
       </w:r>
     </w:p>
     <w:p>
@@ -2681,7 +2677,7 @@
           <w:b w:val="0"/>
           <w:i w:val="0"/>
         </w:rPr>
-        <w:t>Au 7 juillet 2026, 86 scénarios sur 94 sont au statut Passé, 8 restent à rejouer (essentiellement des captures de non-régression sur des fonctionnalités déjà validées par les tests automatisés : connexion, dashboard admin, liste des commandes, création de lot de stock, garde de route, et 3 scénarios d'infrastructure sur la CI/CD). Les deux seuls échecs constatés lors de la campagne précédente — l'absence des headers de sécurité HSTS et CSP en production — ont été corrigés dans infra/nginx/{prod,staging}.conf et vérifiés en direct sur les deux environnements (voir Section 3).</w:t>
+        <w:t>Au 9 juillet 2026, les 95 scénarios du cahier sont au statut Passé (0 échec, 0 à jouer) : la campagne d'exécution manuelle, croisée avec les tests automatisés (PHPUnit, Jest, Cypress), est intégralement close. Les deux seuls échecs constatés lors d'une campagne antérieure — l'absence des headers de sécurité HSTS et CSP en production — ont été corrigés dans infra/nginx/{prod,staging}.conf et vérifiés en direct sur les deux environnements (voir Section 3).</w:t>
       </w:r>
     </w:p>
     <w:p>
@@ -2803,7 +2799,7 @@
           <w:b w:val="0"/>
           <w:i w:val="0"/>
         </w:rPr>
-        <w:t>Détection (CI rouge, retour utilisateur, Sentry, relecture de code) → qualification (sévérité S1 à S4, impact utilisateur) → traitement (branche dédiée GF{n} ou correctif ciblé → Pull Request → revue → merge) → validation (rejeu des tests + déploiement progressif en staging avant la production). Six anomalies réelles, détaillées intégralement dans rendusrncp/FICHES_INCIDENTS.md, illustrent ce processus de bout en bout.</w:t>
+        <w:t>Détection (CI rouge, retour utilisateur, Sentry, relecture de code) → qualification (sévérité S1 à S4, impact utilisateur) → traitement (branche dédiée GF{n} ou correctif ciblé → Pull Request → revue → merge) → validation (rejeu des tests + déploiement progressif en staging avant la production). Huit anomalies réelles, détaillées intégralement dans rendusrncp/FICHES_INCIDENTS.md, illustrent ce processus de bout en bout.</w:t>
       </w:r>
     </w:p>
     <w:p>
@@ -2906,6 +2902,40 @@
           <w:i w:val="0"/>
         </w:rPr>
         <w:t>Détection : en rejouant manuellement le scénario PAY-12 (challenge 3D Secure) du cahier de recettes, une commande refusée restait indéfiniment au statut pending au lieu de passer à failed. Analyse : le endpoint webhook Stripe configuré côté staging n'écoutait que payment_intent.succeeded — le code applicatif traitait pourtant correctement l'événement d'échec dès qu'il le recevait, mais Stripe ne le transmettait jamais faute d'être sélectionné sur la destination. La production, elle, écoutait déjà les deux événements. Correctif : ajout de l'événement manquant à la configuration du endpoint staging côté Dashboard Stripe. Cet exemple illustre une limite structurelle : la configuration des événements Stripe écoutés n'est pas versionnée, contrairement au code — seule l'exécution manuelle du scénario prévu au cahier de recettes a permis de détecter l'écart avant la mise en production définitive.</w:t>
+      </w:r>
+    </w:p>
+    <w:p>
+      <w:pPr>
+        <w:pStyle w:val="Heading2"/>
+      </w:pPr>
+      <w:r>
+        <w:t>Exemple 7 — .env.docker.example manquant : docker compose up échoue sur un clone frais (S2, majeure)</w:t>
+      </w:r>
+    </w:p>
+    <w:p>
+      <w:r>
+        <w:rPr>
+          <w:b w:val="0"/>
+          <w:i w:val="0"/>
+        </w:rPr>
+        <w:t>Détection : test de démarrage sur un zip fraîchement extrait, hors habitudes de développement. Analyse : docker-compose.yml référence .env.docker en env_file, mais ce fichier n'existe que localement (gitignored) et aucun .env.docker.example n'était fourni pour le régénérer sur un clone vierge — le contournement documenté (cp .env.example .env.docker) aurait de toute façon échoué au démarrage réel, l'exemple pointant vers DB_HOST=127.0.0.1 au lieu du nom de service Docker db. Correctif : backend/.env.docker.example créé (placeholders, DB_HOST=db) avec une exception ajoutée au .gitignore, README backend et docs/02-deployment.md mis à jour. Validation : vérifié de bout en bout sur un zip v1.0.0 fraîchement extrait (docker compose up -d → migrate --seed → storage:link → GET /api/health → 200). Consignée sous forme d'issue GitHub réelle (gauthierfitness-backend#79), ouverte puis fermée le jour même via le template .github/ISSUE_TEMPLATE/bug_report.md — premier exemple concret de l'outil de collecte effectivement utilisé, pas seulement documenté (voir Section 3 du Bloc 4, C4.2.1).</w:t>
+      </w:r>
+    </w:p>
+    <w:p>
+      <w:pPr>
+        <w:pStyle w:val="Heading2"/>
+      </w:pPr>
+      <w:r>
+        <w:t>Exemple 8 — CSP trop restrictive : configurateur 3D en page blanche en production (S1, critique)</w:t>
+      </w:r>
+    </w:p>
+    <w:p>
+      <w:r>
+        <w:rPr>
+          <w:b w:val="0"/>
+          <w:i w:val="0"/>
+        </w:rPr>
+        <w:t>Détection : audit Lighthouse authentifié sur la page /products/:slug/customize, jusque-là jamais auditée (score Performance = 0/100, page blanche en production). Analyse : la CSP durcie pour couvrir l'OWASP Top 10 (Section 3) bloquait trois besoins du pipeline Three.js non anticipés lors de sa rédaction : la compilation WebAssembly du décodeur Draco/Meshopt (script-src), les URLs blob: utilisées par GLTFLoader pour charger les textures (connect-src), et la texture HDR d'environnement chargée par défaut depuis un CDN tiers non whitelisté. Correctif : suppression de la dépendance externe plutôt qu'élargissement de la CSP — le fichier HDR est désormais auto-hébergé (frontend/public/hdri/) — puis ajout scopé de 'wasm-unsafe-eval' (préféré à 'unsafe-eval' pour limiter la surface XSS) et de blob: à connect-src/img-src. Validation : audit Lighthouse rejoué après déploiement en staging puis en production (gate manuelle) — Performance 0 → 66, Bonnes pratiques 92 → 100, 0 erreur console contre 6 avant correctif. Cet exemple illustre qu'un header de sécurité vérifié « présent » (cahier de recettes SEC-01/SEC-02) ne garantit pas l'absence de régression fonctionnelle sur les pages qui en dépendent le plus.</w:t>
       </w:r>
     </w:p>
     <w:p>
@@ -2931,7 +2961,7 @@
           <w:i/>
           <w:color w:val="996600"/>
         </w:rPr>
-        <w:t>[CAPTURE À INSÉRER] Captures des runs GitHub Actions échoués puis corrigés (Scramble, E2E), des Pull Requests de correctif, et d'un run vert après chaque fix.</w:t>
+        <w:t>[CAPTURE À INSÉRER] Captures des runs GitHub Actions échoués puis corrigés (Scramble, E2E), des Pull Requests de correctif, et d'un run vert après chaque fix. Pour l'exemple 7 : capture de l'issue gauthierfitness-backend#79. Pour l'exemple 8, déjà disponibles : lighthouse/4-prod-configurateur-avant-fix-csp-page-blanche.png et 4-prod-configurateur-apres-fix-csp.report.html.</w:t>
       </w:r>
     </w:p>
     <w:p>

</xml_diff>

<commit_message>
docs(rendusrncp): add cont-03 support test evidence, sync bloc 2/4 with new support address
</commit_message>
<xml_diff>
--- a/rendusrncp/BLOC2_DOSSIER.docx
+++ b/rendusrncp/BLOC2_DOSSIER.docx
@@ -2324,7 +2324,7 @@
         <w:pStyle w:val="Heading2"/>
       </w:pPr>
       <w:r>
-        <w:t>Couverture — 95 scénarios</w:t>
+        <w:t>Couverture — 96 scénarios</w:t>
       </w:r>
     </w:p>
     <w:tbl>
@@ -2647,7 +2647,7 @@
           </w:tcPr>
           <w:p>
             <w:r>
-              <w:t>2</w:t>
+              <w:t>3</w:t>
             </w:r>
           </w:p>
         </w:tc>
@@ -2660,7 +2660,7 @@
           <w:b w:val="0"/>
           <w:i w:val="0"/>
         </w:rPr>
-        <w:t>Répartis par type : 46 fonctionnels, 38 sécurité, 8 structurels, 3 accessibilité. Répartis par priorité : 59 haute, 32 moyenne, 4 basse. Le domaine Paiement inclut notamment le scénario du challenge 3D Secure (carte de test Stripe), rejoué manuellement en staging.</w:t>
+        <w:t>Répartis par type : 47 fonctionnels, 38 sécurité, 8 structurels, 3 accessibilité. Répartis par priorité : 59 haute, 33 moyenne, 4 basse. Le domaine Paiement inclut notamment le scénario du challenge 3D Secure (carte de test Stripe), rejoué manuellement en staging.</w:t>
       </w:r>
     </w:p>
     <w:p>
@@ -2677,7 +2677,7 @@
           <w:b w:val="0"/>
           <w:i w:val="0"/>
         </w:rPr>
-        <w:t>Au 9 juillet 2026, les 95 scénarios du cahier sont au statut Passé (0 échec, 0 à jouer) : la campagne d'exécution manuelle, croisée avec les tests automatisés (PHPUnit, Jest, Cypress), est intégralement close. Les deux seuls échecs constatés lors d'une campagne antérieure — l'absence des headers de sécurité HSTS et CSP en production — ont été corrigés dans infra/nginx/{prod,staging}.conf et vérifiés en direct sur les deux environnements (voir Section 3).</w:t>
+        <w:t>Au 9 juillet 2026, les 96 scénarios du cahier sont au statut Passé (0 échec, 0 à jouer) : la campagne d'exécution manuelle, croisée avec les tests automatisés (PHPUnit, Jest, Cypress), est intégralement close. Les deux seuls échecs constatés lors d'une campagne antérieure — l'absence des headers de sécurité HSTS et CSP en production — ont été corrigés dans infra/nginx/{prod,staging}.conf et vérifiés en direct sur les deux environnements (voir Section 3). Le dernier scénario ajouté, CONT-03, valide manuellement le canal support en conditions réelles (formulaire /contact → boîte support → réponse du candidat à un testeur externe) et alimente directement le Bloc 4, C4.3.3.</w:t>
       </w:r>
     </w:p>
     <w:p>

</xml_diff>

<commit_message>
fix(docs): recommend Docker over local MySQL for quickstart
</commit_message>
<xml_diff>
--- a/rendusrncp/BLOC2_DOSSIER.docx
+++ b/rendusrncp/BLOC2_DOSSIER.docx
@@ -1329,7 +1329,7 @@
           </w:tcPr>
           <w:p>
             <w:r>
-              <w:t>php artisan test avec SQLite in-memory (162 tests)</w:t>
+              <w:t>php artisan test avec SQLite in-memory (166 tests)</w:t>
             </w:r>
           </w:p>
         </w:tc>
@@ -1528,7 +1528,7 @@
         <w:pStyle w:val="ListBullet"/>
       </w:pPr>
       <w:r>
-        <w:t>Couverture de tests backend : 162 tests PHPUnit verts (cible historique 70 %+ sur le code applicatif avec logique métier).</w:t>
+        <w:t>Couverture de tests backend : 166 tests PHPUnit verts (cible historique 70 %+ sur le code applicatif avec logique métier).</w:t>
       </w:r>
     </w:p>
     <w:p>
@@ -2210,7 +2210,7 @@
           <w:b w:val="0"/>
           <w:i w:val="0"/>
         </w:rPr>
-        <w:t>La suite backend comprend 162 tests PHPUnit (427 assertions), verts sur l'ensemble du domaine applicatif : authentification (inscription, connexion, mot de passe oublié), panier (ajout, stock insuffisant, session invalide), paiement Stripe (création de PaymentIntent, calcul du snapshot de prix, traitement du webhook avec vérification de signature et idempotence, décrémentation FIFO du stock), génération de design IA (modération à 4 niveaux, rejets), et autorisation sur les ressources de personnalisation. Des tests unitaires purs complètent la couverture Feature sur la logique métier isolée : calcul de prix (CartPricingCalculator), allocation FIFO des lots de stock (StockAllocator), évaluation du seuil de modération IA (ModerationThresholdEvaluator) et détection de termes interdits (PromptBlocklist).</w:t>
+        <w:t>La suite backend comprend 166 tests PHPUnit (438 assertions), verts sur l'ensemble du domaine applicatif : authentification (inscription, connexion, mot de passe oublié, gestion du profil et de l'adresse postale), panier (ajout, stock insuffisant, session invalide), paiement Stripe (création de PaymentIntent, calcul du snapshot de prix, traitement du webhook avec vérification de signature et idempotence, décrémentation FIFO du stock), génération de design IA (modération à 4 niveaux, rejets), et autorisation sur les ressources de personnalisation. Des tests unitaires purs complètent la couverture Feature sur la logique métier isolée : calcul de prix (CartPricingCalculator), allocation FIFO des lots de stock (StockAllocator), évaluation du seuil de modération IA (ModerationThresholdEvaluator) et détection de termes interdits (PromptBlocklist).</w:t>
       </w:r>
     </w:p>
     <w:p>
@@ -2219,7 +2219,7 @@
           <w:b w:val="0"/>
           <w:i w:val="0"/>
         </w:rPr>
-        <w:t>Côté frontend, 39 tests Jest couvrent les composants et le state critiques : contexte panier, gardes de route (ProtectedRoute, AdminRoute), store d'authentification, pages d'authentification (connexion, mot de passe oublié, réinitialisation), et le client HTTP (axios).</w:t>
+        <w:t>Côté frontend, 40 tests Jest couvrent les composants et le state critiques : contexte panier, gardes de route (ProtectedRoute, AdminRoute), store d'authentification (dont la mise à jour du profil), pages d'authentification (connexion, mot de passe oublié, réinitialisation), et le client HTTP (axios).</w:t>
       </w:r>
     </w:p>
     <w:p>
@@ -2694,7 +2694,7 @@
           <w:b w:val="0"/>
           <w:i w:val="0"/>
         </w:rPr>
-        <w:t>Les 46 scénarios fonctionnels couvrent le parcours utilisateur de bout en bout (catalogue, panier, personnalisation, paiement, compte). Les 38 scénarios de sécurité recoupent directement la couverture OWASP présentée en Section 3 (contrôle d'accès, injection, authentification, headers). Les 7 scénarios structurels vérifient l'intégrité du pipeline CI/CD et de l'infrastructure de déploiement. Les 3 scénarios d'accessibilité recoupent la Section 4.</w:t>
+        <w:t>Les 47 scénarios fonctionnels couvrent le parcours utilisateur de bout en bout (catalogue, panier, personnalisation, paiement, compte). Les 38 scénarios de sécurité recoupent directement la couverture OWASP présentée en Section 3 (contrôle d'accès, injection, authentification, headers). Les 8 scénarios structurels vérifient l'intégrité du pipeline CI/CD et de l'infrastructure de déploiement. Les 3 scénarios d'accessibilité recoupent la Section 4.</w:t>
       </w:r>
     </w:p>
     <w:p>

</xml_diff>